<commit_message>
docs: consolidate UHMR readiness and configurable activation with technical basis
</commit_message>
<xml_diff>
--- a/00_INDICE_E_GUIA_DO_PACOTE_UHMR.docx
+++ b/00_INDICE_E_GUIA_DO_PACOTE_UHMR.docx
@@ -71,7 +71,7 @@
         </w:rPr>
         <w:t>Cuiabá MT</w:t>
         <w:br/>
-        <w:t>17 de setembro de 2026</w:t>
+        <w:t>28 de setembro de 2026</w:t>
       </w:r>
     </w:p>
     <w:p>
@@ -164,6 +164,7 @@
         </w:tc>
       </w:tr>
       <w:tr>
+        <w:trPr/>
         <w:tc>
           <w:tcPr>
             <w:tcW w:type="dxa" w:w="2381"/>
@@ -230,6 +231,7 @@
         </w:tc>
       </w:tr>
       <w:tr>
+        <w:trPr/>
         <w:tc>
           <w:tcPr>
             <w:tcW w:type="dxa" w:w="2381"/>
@@ -298,6 +300,7 @@
         </w:tc>
       </w:tr>
       <w:tr>
+        <w:trPr/>
         <w:tc>
           <w:tcPr>
             <w:tcW w:type="dxa" w:w="2381"/>
@@ -364,6 +367,7 @@
         </w:tc>
       </w:tr>
       <w:tr>
+        <w:trPr/>
         <w:tc>
           <w:tcPr>
             <w:tcW w:type="dxa" w:w="2381"/>
@@ -423,10 +427,7 @@
               <w:jc w:val="left"/>
             </w:pPr>
             <w:r>
-              <w:rPr>
-                <w:sz w:val="17"/>
-              </w:rPr>
-              <w:t>1.0 de 17/09/2026</w:t>
+              <w:t>2.1 de 28/09/2026</w:t>
             </w:r>
           </w:p>
         </w:tc>
@@ -441,13 +442,112 @@
       <w:pPr>
         <w:pStyle w:val="Heading1"/>
       </w:pPr>
+      <w:commentRangeStart w:id="0"/>
+      <w:r>
+        <w:t>Diretrizes de prontidão e acionamento</w:t>
+      </w:r>
+      <w:commentRangeEnd w:id="0"/>
+      <w:r>
+        <w:rPr>
+          <w:rStyle w:val="CommentReference"/>
+        </w:rPr>
+        <w:commentReference w:id="0"/>
+      </w:r>
+    </w:p>
+    <w:p>
+      <w:r>
+        <w:t>Revisão 2.1 de 28/09/2026. Minuta para validação institucional. As diretrizes abaixo integram o planejamento e devem orientar os requisitos e formulários desta peça.</w:t>
+      </w:r>
+    </w:p>
+    <w:p>
+      <w:pPr>
+        <w:pStyle w:val="Heading2"/>
+      </w:pPr>
+      <w:r>
+        <w:t>N0 e remuneração da prontidão</w:t>
+      </w:r>
+    </w:p>
+    <w:p>
+      <w:r>
+        <w:t>N0 permanece como prontidão, sem assistência ativa. A mensalidade remunera a capacidade contratada mantida disponível mesmo sem utilização, mediante aceite inicial e comprovação mensal de inventário, conservação, testes, manutenção, equipe técnica e meios de mobilização. A indisponibilidade será registrada e terá tratamento de medição conforme critérios contratuais. A permanência da mensalidade durante missões exige demonstração das obrigações efetivamente mantidas e exclusão de custos duplicados nas parcelas variáveis.</w:t>
+      </w:r>
+    </w:p>
+    <w:p>
+      <w:pPr>
+        <w:pStyle w:val="Heading2"/>
+      </w:pPr>
+      <w:r>
+        <w:t>Configuração personalizada da missão</w:t>
+      </w:r>
+    </w:p>
+    <w:p>
+      <w:r>
+        <w:t>N1 a N4 são referências de planejamento, sem obrigação de ativação cumulativa. Cada missão poderá selecionar módulos isolados, combinar módulos ou adotar quantitativos diferentes das faixas referenciais, dentro do objeto, dos quantitativos contratados e dos requisitos de segurança. São exemplos: dez leitos com suportes dimensionados; somente laboratório; somente medicamentos e insumos. A configuração efetiva e o nível de referência serão registrados separadamente. Não se presumem cirurgia, internação, equipes ou infraestrutura não solicitadas. As dependências técnicas indispensáveis serão justificadas e dimensionadas, inclusive quando fornecidas pela rede local.</w:t>
+      </w:r>
+    </w:p>
+    <w:p>
+      <w:pPr>
+        <w:pStyle w:val="Heading2"/>
+      </w:pPr>
+      <w:r>
+        <w:t>Responsabilidade pela manutenção</w:t>
+      </w:r>
+    </w:p>
+    <w:p>
+      <w:r>
+        <w:t>A contratada executará e custeará manutenção preventiva e corretiva ordinária, calibrações aplicáveis, testes, peças, mão de obra e substituição dos equipamentos necessários à disponibilidade. Esses encargos integram os preços contratados, inclusive durante períodos sem uso, sem cobrança adicional à SES-MT por manutenção ordinária. O plano de manutenção seguirá fabricante, risco e requisitos técnicos, com registros por equipamento, datas, responsável e evidências. A manutenção programada não poderá reduzir a capacidade garantida sem cobertura equivalente e comunicação à fiscalização.</w:t>
+      </w:r>
+    </w:p>
+    <w:p>
+      <w:pPr>
+        <w:pStyle w:val="Heading2"/>
+      </w:pPr>
+      <w:r>
+        <w:t>Fornecimento exclusivo de medicamentos</w:t>
+      </w:r>
+    </w:p>
+    <w:p>
+      <w:r>
+        <w:t>Poderá ser acionado somente o fornecimento de medicamentos ou insumos previamente especificados e precificados, sem montagem hospitalar. A solicitação discriminará item, apresentação, concentração quando pertinente, unidade, quantidade, destino, prazo, lote e validade no recebimento, condições de conservação e responsável pelo aceite. Armazenagem, transporte, cadeia de frio quando aplicável, rastreabilidade, regularidade sanitária e responsabilidade farmacêutica deverão ser assegurados. Estoque reservado, mercadoria fornecida e reposição serão distinguidos na medição. Perdas por vencimento ou conservação imputáveis à contratada não serão repassadas à SES-MT. A relação de itens e o parcelamento ainda dependem de planejamento e validação formal.</w:t>
+      </w:r>
+    </w:p>
+    <w:p>
+      <w:pPr>
+        <w:pStyle w:val="Heading2"/>
+      </w:pPr>
+      <w:r>
+        <w:t>Competência e fundamentação do acionamento</w:t>
+      </w:r>
+    </w:p>
+    <w:p>
+      <w:r>
+        <w:t>Compete ao Secretário de Estado de Saúde autorizar o acionamento e a configuração da missão, mediante Ordem de Acionamento fundamentada em documentação técnica, análise de risco e avaliação de cenários. A instrução conterá identificação do evento, demanda estimada, capacidade residual da rede, alternativas, justificativa, módulos ou itens, quantidades, dependências, local, prazo, duração, estimativa de custo e disponibilidade contratual e orçamentária. As áreas técnicas, inclusive CIEVS/COES quando envolvidos, subsidiam a decisão. A fiscalização acompanha a execução e não substitui a autorização do Secretário. Ampliação, redução e encerramento serão formalizados com justificativa técnica e decisão do Secretário, preservada a interrupção imediata de atividade insegura pela fiscalização.</w:t>
+      </w:r>
+    </w:p>
+    <w:p>
+      <w:pPr>
+        <w:pStyle w:val="Heading2"/>
+      </w:pPr>
+      <w:r>
+        <w:t>Medição por configuração e aceite</w:t>
+      </w:r>
+    </w:p>
+    <w:p>
+      <w:r>
+        <w:t>A medição separará mensalidade N0, serviços efetivamente acionados e aceitos e medicamentos/insumos fornecidos. Cada item terá unidade, quantidade, preço, período, origem e evidência. Suportes compartilhados serão contabilizados uma única vez. Manutenção ordinária, perdas imputáveis à contratada e itens já pagos não gerarão nova cobrança. Para fornecimento exclusivo, não incidem montagem, diária hospitalar ou desmobilização física inexistentes. O aceite será de recebimento dos produtos. Para laboratório isolado ou assistência, aplicam-se comissionamento e liberação compatíveis com a atividade. Preços, glosas e SLAs permanecem sujeitos a pesquisa de mercado e validação antes do edital.</w:t>
+      </w:r>
+    </w:p>
+    <w:p>
+      <w:pPr>
+        <w:pStyle w:val="Heading1"/>
+      </w:pPr>
       <w:r>
         <w:t>1. Decisão proposta</w:t>
       </w:r>
     </w:p>
     <w:p>
       <w:r>
-        <w:t>Estruturar a contratação como capacidade estadual de prontidão e resposta, medida por níveis N0 a N4. O contrato deve permitir ativação progressiva, preços unitários por componente e responsabilidade integrada pelo desempenho, sem obrigar a SES MT a pagar permanentemente pela maior configuração.</w:t>
+        <w:t>Estruturar a contratação como capacidade estadual de prontidão e resposta, medida por níveis N0 a N4. O contrato deve permitir ativação independente e personalizada, preços unitários por componente e responsabilidade integrada pelo desempenho, sem obrigar a SES MT a pagar permanentemente pela maior configuração.</w:t>
       </w:r>
     </w:p>
     <w:p>
@@ -618,6 +718,7 @@
         </w:tc>
       </w:tr>
       <w:tr>
+        <w:trPr/>
         <w:tc>
           <w:tcPr>
             <w:tcW w:type="dxa" w:w="680"/>
@@ -748,6 +849,7 @@
         </w:tc>
       </w:tr>
       <w:tr>
+        <w:trPr/>
         <w:tc>
           <w:tcPr>
             <w:tcW w:type="dxa" w:w="680"/>
@@ -882,6 +984,7 @@
         </w:tc>
       </w:tr>
       <w:tr>
+        <w:trPr/>
         <w:tc>
           <w:tcPr>
             <w:tcW w:type="dxa" w:w="680"/>
@@ -1012,6 +1115,7 @@
         </w:tc>
       </w:tr>
       <w:tr>
+        <w:trPr/>
         <w:tc>
           <w:tcPr>
             <w:tcW w:type="dxa" w:w="680"/>
@@ -1146,6 +1250,7 @@
         </w:tc>
       </w:tr>
       <w:tr>
+        <w:trPr/>
         <w:tc>
           <w:tcPr>
             <w:tcW w:type="dxa" w:w="680"/>
@@ -1276,6 +1381,7 @@
         </w:tc>
       </w:tr>
       <w:tr>
+        <w:trPr/>
         <w:tc>
           <w:tcPr>
             <w:tcW w:type="dxa" w:w="680"/>
@@ -1410,6 +1516,7 @@
         </w:tc>
       </w:tr>
       <w:tr>
+        <w:trPr/>
         <w:tc>
           <w:tcPr>
             <w:tcW w:type="dxa" w:w="680"/>
@@ -1743,6 +1850,7 @@
         </w:tc>
       </w:tr>
       <w:tr>
+        <w:trPr/>
         <w:tc>
           <w:tcPr>
             <w:tcW w:type="dxa" w:w="680"/>
@@ -1905,6 +2013,7 @@
         </w:tc>
       </w:tr>
       <w:tr>
+        <w:trPr/>
         <w:tc>
           <w:tcPr>
             <w:tcW w:type="dxa" w:w="680"/>
@@ -2072,6 +2181,7 @@
         </w:tc>
       </w:tr>
       <w:tr>
+        <w:trPr/>
         <w:tc>
           <w:tcPr>
             <w:tcW w:type="dxa" w:w="680"/>
@@ -2196,7 +2306,7 @@
               <w:rPr>
                 <w:sz w:val="15"/>
               </w:rPr>
-              <w:t>N1, internação, laboratório, imagem básica e isolamento acionável</w:t>
+              <w:t>Módulos selecionáveis: internação, laboratório, imagem básica e isolamento</w:t>
             </w:r>
           </w:p>
         </w:tc>
@@ -2234,6 +2344,7 @@
         </w:tc>
       </w:tr>
       <w:tr>
+        <w:trPr/>
         <w:tc>
           <w:tcPr>
             <w:tcW w:type="dxa" w:w="680"/>
@@ -2401,6 +2512,7 @@
         </w:tc>
       </w:tr>
       <w:tr>
+        <w:trPr/>
         <w:tc>
           <w:tcPr>
             <w:tcW w:type="dxa" w:w="680"/>
@@ -2525,7 +2637,7 @@
               <w:rPr>
                 <w:sz w:val="15"/>
               </w:rPr>
-              <w:t>N3, expansão de leitos, segunda sala, cuidados intensivos e especialidades</w:t>
+              <w:t>Módulos selecionáveis: leitos, cirurgia, cuidados intensivos e especialidades</w:t>
             </w:r>
           </w:p>
         </w:tc>
@@ -2794,6 +2906,7 @@
         </w:tc>
       </w:tr>
       <w:tr>
+        <w:trPr/>
         <w:tc>
           <w:tcPr>
             <w:tcW w:type="dxa" w:w="3286"/>
@@ -2892,6 +3005,7 @@
         </w:tc>
       </w:tr>
       <w:tr>
+        <w:trPr/>
         <w:tc>
           <w:tcPr>
             <w:tcW w:type="dxa" w:w="3286"/>
@@ -2993,6 +3107,7 @@
         </w:tc>
       </w:tr>
       <w:tr>
+        <w:trPr/>
         <w:tc>
           <w:tcPr>
             <w:tcW w:type="dxa" w:w="3286"/>
@@ -3091,6 +3206,7 @@
         </w:tc>
       </w:tr>
       <w:tr>
+        <w:trPr/>
         <w:tc>
           <w:tcPr>
             <w:tcW w:type="dxa" w:w="3286"/>
@@ -3192,6 +3308,7 @@
         </w:tc>
       </w:tr>
       <w:tr>
+        <w:trPr/>
         <w:tc>
           <w:tcPr>
             <w:tcW w:type="dxa" w:w="3286"/>
@@ -3290,6 +3407,7 @@
         </w:tc>
       </w:tr>
       <w:tr>
+        <w:trPr/>
         <w:tc>
           <w:tcPr>
             <w:tcW w:type="dxa" w:w="3286"/>
@@ -3391,6 +3509,7 @@
         </w:tc>
       </w:tr>
       <w:tr>
+        <w:trPr/>
         <w:tc>
           <w:tcPr>
             <w:tcW w:type="dxa" w:w="3286"/>
@@ -3622,6 +3741,7 @@
         </w:tc>
       </w:tr>
       <w:tr>
+        <w:trPr/>
         <w:tc>
           <w:tcPr>
             <w:tcW w:type="dxa" w:w="3286"/>
@@ -3720,6 +3840,7 @@
         </w:tc>
       </w:tr>
       <w:tr>
+        <w:trPr/>
         <w:tc>
           <w:tcPr>
             <w:tcW w:type="dxa" w:w="3286"/>
@@ -3821,6 +3942,7 @@
         </w:tc>
       </w:tr>
       <w:tr>
+        <w:trPr/>
         <w:tc>
           <w:tcPr>
             <w:tcW w:type="dxa" w:w="3286"/>
@@ -3919,6 +4041,7 @@
         </w:tc>
       </w:tr>
       <w:tr>
+        <w:trPr/>
         <w:tc>
           <w:tcPr>
             <w:tcW w:type="dxa" w:w="3286"/>
@@ -4020,6 +4143,7 @@
         </w:tc>
       </w:tr>
       <w:tr>
+        <w:trPr/>
         <w:tc>
           <w:tcPr>
             <w:tcW w:type="dxa" w:w="3286"/>
@@ -4118,6 +4242,7 @@
         </w:tc>
       </w:tr>
       <w:tr>
+        <w:trPr/>
         <w:tc>
           <w:tcPr>
             <w:tcW w:type="dxa" w:w="3286"/>
@@ -4219,6 +4344,7 @@
         </w:tc>
       </w:tr>
       <w:tr>
+        <w:trPr/>
         <w:tc>
           <w:tcPr>
             <w:tcW w:type="dxa" w:w="3286"/>
@@ -4410,6 +4536,88 @@
         <w:t>Ministério do Trabalho e Emprego. NR 32, Segurança e Saúde no Trabalho em Serviços de Saúde, em sua versão vigente.</w:t>
       </w:r>
     </w:p>
+    <w:p>
+      <w:r>
+        <w:br w:type="page"/>
+      </w:r>
+    </w:p>
+    <w:p>
+      <w:pPr>
+        <w:pStyle w:val="Heading1"/>
+      </w:pPr>
+      <w:r>
+        <w:t>Complementação técnica e normativa — revisão 2.1</w:t>
+      </w:r>
+    </w:p>
+    <w:p>
+      <w:r>
+        <w:t>Integra esta minuta como requisito de revisão. As escolhas propostas dependem de validação institucional; as referências não equivalem a aprovação da contratação.</w:t>
+      </w:r>
+    </w:p>
+    <w:p>
+      <w:pPr>
+        <w:pStyle w:val="Heading2"/>
+      </w:pPr>
+      <w:r>
+        <w:t>1. Fundamentos e limites de aplicação</w:t>
+      </w:r>
+    </w:p>
+    <w:p>
+      <w:r>
+        <w:t>A Lei nº 14.133/2021 orienta planejamento (art. 18), estimativa de preços (art. 23), parcelamento de compras e serviços (arts. 40 e 47), cláusulas contratuais (art. 92), fiscalização (art. 117) e recebimento (art. 140). Aplicam-se o Decreto Estadual nº 1.525/2022 e alterações, com conferência da consolidação pela área jurídica. A inclusão no PCA deve observar os atos estaduais pertinentes, inclusive IN nº 002/2025/SEPLAG e sua alteração pela IN nº 003/2026/SEPLAG. A escolha de prontidão remunerada exige motivação própria; nenhuma dessas referências, isoladamente, aprova preço, modalidade, lote único ou contratação direta.</w:t>
+      </w:r>
+    </w:p>
+    <w:p>
+      <w:pPr>
+        <w:pStyle w:val="Heading2"/>
+      </w:pPr>
+      <w:r>
+        <w:t>11. Condições para concluir a versão de edital</w:t>
+      </w:r>
+    </w:p>
+    <w:p>
+      <w:r>
+        <w:t>Permanecem pendentes de decisão institucional: solução e parcelamento, modalidade e critério de julgamento, catálogo e limites, quantitativos sustentados por dados, preços pesquisados, reserva orçamentária, SLAs, matriz de riscos, licenciamento e ato de competência. Menções anteriores a modalidade, técnica e preço, faixas de leitos, prazos ou percentuais são propostas a harmonizar na versão final. Não declarar a contratação aprovada ou pronta para publicação antes dessas validações. As diretrizes OMS para equipes médicas de emergência são referência técnica complementar; N0–N4 é classificação interna do projeto e não representa classificação ou certificação OMS.</w:t>
+      </w:r>
+    </w:p>
+    <w:p>
+      <w:pPr>
+        <w:pStyle w:val="Heading2"/>
+      </w:pPr>
+      <w:r>
+        <w:t>Referências da complementação</w:t>
+      </w:r>
+    </w:p>
+    <w:p>
+      <w:r>
+        <w:t>Brasil. Lei nº 14.133, de 1º de abril de 2021. Texto compilado. Disponível em: https://www.planalto.gov.br/ccivil_03/_ato2019-2022/2021/lei/l14133.htm. Acesso em: 28 set. 2026.</w:t>
+      </w:r>
+    </w:p>
+    <w:p>
+      <w:r>
+        <w:t>Mato Grosso. SEPLAG. Portal de Aquisições Governamentais: legislação e atos do PCA. Disponível em: https://aquisicoes.seplag.mt.gov.br/home/index.php?c=4&amp;pg=ver. Acesso em: 28 set. 2026.</w:t>
+      </w:r>
+    </w:p>
+    <w:p>
+      <w:r>
+        <w:t>Anvisa. RDC nº 509, de 27 de maio de 2021. Gerenciamento de tecnologias em saúde. Disponível em: https://bvsms.saude.gov.br/bvs/saudelegis/anvisa/2020/rdc0509_27_05_2021.pdf. Acesso em: 28 set. 2026.</w:t>
+      </w:r>
+    </w:p>
+    <w:p>
+      <w:r>
+        <w:t>Anvisa. Agenda de ARR 2023–2026: RDC nº 978/2025, alterada pela RDC nº 986/2025. Disponível em: https://www.gov.br/anvisa/pt-br/assuntos/regulamentacao/avaliacao-do-resultado-regulatorio/agenda-de-arr-2023-2026. Acesso em: 28 set. 2026.</w:t>
+      </w:r>
+    </w:p>
+    <w:p>
+      <w:r>
+        <w:t>Anvisa. Perguntas e respostas sobre a RDC nº 430/2020. Atualização de novembro de 2022. Disponível em: https://www.gov.br/anvisa/pt-br/centraisdeconteudo/publicacoes/certificacao-e-fiscalizacao/perguntas-e-respostas/perguntas-e-respostas-rdc-430-de-2020.pdf. Acesso em: 28 set. 2026.</w:t>
+      </w:r>
+    </w:p>
+    <w:p>
+      <w:r>
+        <w:t>World Health Organization. Classification and minimum standards for emergency medical teams. Geneva: WHO, 2021. Disponível em: https://extranet.who.int/emt/sites/default/files/BlueBook2021.pdf. Acesso em: 28 set. 2026.</w:t>
+      </w:r>
+    </w:p>
     <w:sectPr>
       <w:headerReference w:type="default" r:id="rId9"/>
       <w:footerReference w:type="default" r:id="rId10"/>
@@ -4422,6 +4630,27 @@
 </w:document>
 </file>
 
+<file path=word/comments.xml><?xml version="1.0" encoding="utf-8"?>
+<w:comments xmlns:a="http://schemas.openxmlformats.org/drawingml/2006/main" xmlns:pic="http://schemas.openxmlformats.org/drawingml/2006/picture" xmlns:r="http://schemas.openxmlformats.org/officeDocument/2006/relationships" xmlns:w="http://schemas.openxmlformats.org/wordprocessingml/2006/main" xmlns:wp="http://schemas.openxmlformats.org/drawingml/2006/wordprocessingDrawing" xmlns:mc="http://schemas.openxmlformats.org/markup-compatibility/2006" xmlns:a14="http://schemas.microsoft.com/office/drawing/2010/main" xmlns:w14="http://schemas.microsoft.com/office/word/2010/wordml" xmlns:wpc="http://schemas.microsoft.com/office/word/2010/wordprocessingCanvas">
+  <w:comment w:id="0" w:author="Revisão técnica UHMR" w:initials="UHMR" w:date="2026-09-28T20:44:19Z">
+    <w:p>
+      <w:pPr>
+        <w:pStyle w:val="CommentText"/>
+      </w:pPr>
+      <w:r>
+        <w:rPr>
+          <w:rStyle w:val="CommentReference"/>
+        </w:rPr>
+        <w:annotationRef/>
+      </w:r>
+      <w:r>
+        <w:t>Revisão decorrente das premissas definidas em 28/09/2026: N0 remunerado, módulos independentes, manutenção pela empresa, medicamentos isolados e autorização do Secretário com análise de risco e cenários. Pendente de validação institucional.</w:t>
+      </w:r>
+    </w:p>
+  </w:comment>
+</w:comments>
+</file>
+
 <file path=word/footer1.xml><?xml version="1.0" encoding="utf-8"?>
 <w:ftr xmlns:m="http://schemas.openxmlformats.org/officeDocument/2006/math" xmlns:mc="http://schemas.openxmlformats.org/markup-compatibility/2006" xmlns:mo="http://schemas.microsoft.com/office/mac/office/2008/main" xmlns:mv="urn:schemas-microsoft-com:mac:vml" xmlns:o="urn:schemas-microsoft-com:office:office" xmlns:r="http://schemas.openxmlformats.org/officeDocument/2006/relationships" xmlns:v="urn:schemas-microsoft-com:vml" xmlns:w10="urn:schemas-microsoft-com:office:word" xmlns:w14="http://schemas.microsoft.com/office/word/2010/wordml" xmlns:w="http://schemas.openxmlformats.org/wordprocessingml/2006/main" xmlns:wne="http://schemas.microsoft.com/office/word/2006/wordml" xmlns:wp14="http://schemas.microsoft.com/office/word/2010/wordprocessingDrawing" xmlns:wp="http://schemas.openxmlformats.org/drawingml/2006/wordprocessingDrawing" xmlns:wpc="http://schemas.microsoft.com/office/word/2010/wordprocessingCanvas" xmlns:wpg="http://schemas.microsoft.com/office/word/2010/wordprocessingGroup" xmlns:wpi="http://schemas.microsoft.com/office/word/2010/wordprocessingInk" xmlns:wps="http://schemas.microsoft.com/office/word/2010/wordprocessingShape" mc:Ignorable="w14 wp14">
   <w:p>
@@ -4435,7 +4664,7 @@
         <w:color w:val="666666"/>
         <w:sz w:val="16"/>
       </w:rPr>
-      <w:t xml:space="preserve">Versão 1.0   17 09 2026   </w:t>
+      <w:t xml:space="preserve">Revisão 2.1  28/09/2026   </w:t>
     </w:r>
     <w:r>
       <w:rPr>

</xml_diff>